<commit_message>
module-7/Jordan - Movies Table Queries.docx
</commit_message>
<xml_diff>
--- a/module-7/Jordan - Movies Table Queries.docx
+++ b/module-7/Jordan - Movies Table Queries.docx
@@ -201,7 +201,7 @@
       </w:pPr>
       <w:r>
         <w:drawing>
-          <wp:inline xmlns:wp14="http://schemas.microsoft.com/office/word/2010/wordprocessingDrawing" wp14:editId="535C3FCA" wp14:anchorId="4E71AAF1">
+          <wp:inline xmlns:wp14="http://schemas.microsoft.com/office/word/2010/wordprocessingDrawing" wp14:editId="010383F9" wp14:anchorId="4E71AAF1">
             <wp:extent cx="5943600" cy="3552825"/>
             <wp:effectExtent l="0" t="0" r="0" b="0"/>
             <wp:docPr id="967920422" name="drawing"/>
@@ -241,6 +241,35 @@
             </a:graphic>
           </wp:inline>
         </w:drawing>
+      </w:r>
+    </w:p>
+    <w:p>
+      <w:pPr>
+        <w:pStyle w:val="Normal"/>
+        <w:rPr>
+          <w:rFonts w:ascii="Times New Roman" w:hAnsi="Times New Roman" w:eastAsia="Times New Roman" w:cs="Times New Roman"/>
+        </w:rPr>
+      </w:pPr>
+      <w:r>
+        <w:rPr>
+          <w:rFonts w:ascii="Times New Roman" w:hAnsi="Times New Roman" w:eastAsia="Times New Roman" w:cs="Times New Roman"/>
+        </w:rPr>
+        <w:t xml:space="preserve">GitHub link: </w:t>
+      </w:r>
+      <w:hyperlink r:id="R384a13cad37d40bf">
+        <w:r>
+          <w:rPr>
+            <w:rStyle w:val="Hyperlink"/>
+            <w:rFonts w:ascii="Times New Roman" w:hAnsi="Times New Roman" w:eastAsia="Times New Roman" w:cs="Times New Roman"/>
+          </w:rPr>
+          <w:t>https://github.com/acjordan05/csd-310</w:t>
+        </w:r>
+      </w:hyperlink>
+      <w:r>
+        <w:rPr>
+          <w:rFonts w:ascii="Times New Roman" w:hAnsi="Times New Roman" w:eastAsia="Times New Roman" w:cs="Times New Roman"/>
+        </w:rPr>
+        <w:t xml:space="preserve"> </w:t>
       </w:r>
     </w:p>
     <w:p xmlns:wp14="http://schemas.microsoft.com/office/word/2010/wordml" wp14:paraId="2C078E63" wp14:textId="420F9040"/>
@@ -675,6 +704,17 @@
     <w:semiHidden/>
     <w:unhideWhenUsed/>
   </w:style>
+  <w:style w:type="character" w:styleId="Hyperlink">
+    <w:uiPriority w:val="99"/>
+    <w:name w:val="Hyperlink"/>
+    <w:basedOn w:val="DefaultParagraphFont"/>
+    <w:unhideWhenUsed/>
+    <w:rsid w:val="660A4110"/>
+    <w:rPr>
+      <w:color w:val="467886"/>
+      <w:u w:val="single"/>
+    </w:rPr>
+  </w:style>
 </w:styles>
 </file>
 

</xml_diff>